<commit_message>
docs: manual v1.1 — new first-run flow (welcome choice screen, sample class only on demand)
</commit_message>
<xml_diff>
--- a/media/manual/SPR-with-Mo_Teachers-Operation-Manual.docx
+++ b/media/manual/SPR-with-Mo_Teachers-Operation-Manual.docx
@@ -101,7 +101,7 @@
           <w:i w:val="0"/>
           <w:sz w:val="21"/>
         </w:rPr>
-        <w:t>Manual version 1.0  ·  October 2026</w:t>
+        <w:t>Manual version 1.1  ·  October 2026</w:t>
       </w:r>
     </w:p>
     <w:p>
@@ -177,7 +177,7 @@
         <w:spacing w:after="60"/>
       </w:pPr>
       <w:r>
-        <w:t>7.  The sample class (Demo School)</w:t>
+        <w:t>7.  The sample class (Demo School) — only if you ask for it</w:t>
       </w:r>
     </w:p>
     <w:p>
@@ -367,7 +367,7 @@
         <w:spacing w:after="60"/>
       </w:pPr>
       <w:r>
-        <w:t>The pictures in this manual were taken from the app's built-in sample class, so your screen may show different names.</w:t>
+        <w:t>The pictures in this manual were taken with the app's optional sample class (loaded via “Load sample data”), so your screen may show different names.</w:t>
       </w:r>
     </w:p>
     <w:tbl>
@@ -639,7 +639,7 @@
           <w:b w:val="0"/>
           <w:i w:val="0"/>
         </w:rPr>
-        <w:t>The first time you open the app on a computer, it asks you to do three things: read the privacy notice, create a sign-in (username + password), and then it opens with a sample class you can explore.</w:t>
+        <w:t>The first time you open the app on a computer, it asks you to do three things: read the privacy notice, create a sign-in (username + password), and then choose how to start your first class.</w:t>
       </w:r>
     </w:p>
     <w:p>
@@ -954,10 +954,10 @@
     </w:p>
     <w:p>
       <w:pPr>
-        <w:pStyle w:val="Heading1"/>
+        <w:pStyle w:val="Heading2"/>
       </w:pPr>
       <w:r>
-        <w:t>5.  Sign in on another day</w:t>
+        <w:t>Step 4 — Choose how to start</w:t>
       </w:r>
     </w:p>
     <w:p>
@@ -969,7 +969,34 @@
           <w:b w:val="0"/>
           <w:i w:val="0"/>
         </w:rPr>
-        <w:t>Every time you open the app after that, it shows the sign-in screen. Type your username and password and click “Sign In”.</w:t>
+        <w:t>After your sign-in is created, the app shows the “Set up your first class” screen with three choices. Nothing is pre-loaded — the choice is yours:</w:t>
+      </w:r>
+    </w:p>
+    <w:p>
+      <w:pPr>
+        <w:pStyle w:val="ListBullet"/>
+        <w:spacing w:after="60"/>
+      </w:pPr>
+      <w:r>
+        <w:t>New class (guided setup) — start your own real class. This is the normal choice for most teachers (see section 14.1).</w:t>
+      </w:r>
+    </w:p>
+    <w:p>
+      <w:pPr>
+        <w:pStyle w:val="ListBullet"/>
+        <w:spacing w:after="60"/>
+      </w:pPr>
+      <w:r>
+        <w:t>Import SPR Excel file — bring in a class you saved from Excel before (see section 15.2).</w:t>
+      </w:r>
+    </w:p>
+    <w:p>
+      <w:pPr>
+        <w:pStyle w:val="ListBullet"/>
+        <w:spacing w:after="60"/>
+      </w:pPr>
+      <w:r>
+        <w:t>Load sample data — load a pretend class (Demo School) just to press buttons and learn. You can delete it later.</w:t>
       </w:r>
     </w:p>
     <w:p>
@@ -988,7 +1015,7 @@
               <a:graphicData uri="http://schemas.openxmlformats.org/drawingml/2006/picture">
                 <pic:pic>
                   <pic:nvPicPr>
-                    <pic:cNvPr id="0" name="05_signin_lock_screen.png"/>
+                    <pic:cNvPr id="0" name="03_welcome_choice.png"/>
                     <pic:cNvPicPr/>
                   </pic:nvPicPr>
                   <pic:blipFill>
@@ -1022,7 +1049,114 @@
           <w:color w:val="666666"/>
           <w:sz w:val="19"/>
         </w:rPr>
-        <w:t>Figure 4 — The sign-in screen.</w:t>
+        <w:t>Figure 4 — The “Set up your first class” screen. Choose how to begin.</w:t>
+      </w:r>
+    </w:p>
+    <w:tbl>
+      <w:tblPr>
+        <w:tblW w:type="auto" w:w="0"/>
+        <w:jc w:val="center"/>
+        <w:tblLook w:firstColumn="1" w:firstRow="1" w:lastColumn="0" w:lastRow="0" w:noHBand="0" w:noVBand="1" w:val="04A0"/>
+      </w:tblPr>
+      <w:tblGrid>
+        <w:gridCol w:w="9746"/>
+      </w:tblGrid>
+      <w:tr>
+        <w:tc>
+          <w:tcPr>
+            <w:tcW w:type="dxa" w:w="9746"/>
+            <w:shd w:val="clear" w:fill="E8F1FA"/>
+          </w:tcPr>
+          <w:p>
+            <w:r>
+              <w:rPr>
+                <w:b/>
+              </w:rPr>
+              <w:t xml:space="preserve">TIP:  </w:t>
+            </w:r>
+            <w:r>
+              <w:t>If you pick “Load sample data”, the pretend class is only there for practice. When you are ready for your real class, go to Manage &amp; setup and delete the sample semesters (section 14.2).</w:t>
+            </w:r>
+          </w:p>
+        </w:tc>
+      </w:tr>
+    </w:tbl>
+    <w:p>
+      <w:pPr>
+        <w:spacing w:after="0"/>
+      </w:pPr>
+    </w:p>
+    <w:p>
+      <w:pPr>
+        <w:pStyle w:val="Heading1"/>
+      </w:pPr>
+      <w:r>
+        <w:t>5.  Sign in on another day</w:t>
+      </w:r>
+    </w:p>
+    <w:p>
+      <w:pPr>
+        <w:spacing w:after="120"/>
+      </w:pPr>
+      <w:r>
+        <w:rPr>
+          <w:b w:val="0"/>
+          <w:i w:val="0"/>
+        </w:rPr>
+        <w:t>Every time you open the app after that, it shows the sign-in screen. Type your username and password and click “Sign In”.</w:t>
+      </w:r>
+    </w:p>
+    <w:p>
+      <w:pPr>
+        <w:jc w:val="center"/>
+      </w:pPr>
+      <w:r>
+        <w:drawing>
+          <wp:inline xmlns:a="http://schemas.openxmlformats.org/drawingml/2006/main" xmlns:pic="http://schemas.openxmlformats.org/drawingml/2006/picture">
+            <wp:extent cx="5760000" cy="3795022"/>
+            <wp:docPr id="5" name="Picture 5"/>
+            <wp:cNvGraphicFramePr>
+              <a:graphicFrameLocks noChangeAspect="1"/>
+            </wp:cNvGraphicFramePr>
+            <a:graphic>
+              <a:graphicData uri="http://schemas.openxmlformats.org/drawingml/2006/picture">
+                <pic:pic>
+                  <pic:nvPicPr>
+                    <pic:cNvPr id="0" name="05_signin_lock_screen.png"/>
+                    <pic:cNvPicPr/>
+                  </pic:nvPicPr>
+                  <pic:blipFill>
+                    <a:blip r:embed="rId14"/>
+                    <a:stretch>
+                      <a:fillRect/>
+                    </a:stretch>
+                  </pic:blipFill>
+                  <pic:spPr>
+                    <a:xfrm>
+                      <a:off x="0" y="0"/>
+                      <a:ext cx="5760000" cy="3795022"/>
+                    </a:xfrm>
+                    <a:prstGeom prst="rect"/>
+                  </pic:spPr>
+                </pic:pic>
+              </a:graphicData>
+            </a:graphic>
+          </wp:inline>
+        </w:drawing>
+      </w:r>
+    </w:p>
+    <w:p>
+      <w:pPr>
+        <w:spacing w:after="200"/>
+        <w:jc w:val="center"/>
+      </w:pPr>
+      <w:r>
+        <w:rPr>
+          <w:i/>
+          <w:color w:val="666666"/>
+          <w:sz w:val="19"/>
+        </w:rPr>
+        <w:t>Figure 5 — The sign-in screen.</w:t>
       </w:r>
     </w:p>
     <w:p>
@@ -1069,7 +1203,7 @@
           <w:b w:val="0"/>
           <w:i w:val="0"/>
         </w:rPr>
-        <w:t>After signing in you see the main screen. It has three important parts:</w:t>
+        <w:t>After signing in you see the main screen. (If this is a completely new start, you first see the “Set up your first class” screen — pick an option there and the main screen follows.) The main screen has three important parts:</w:t>
       </w:r>
     </w:p>
     <w:p>
@@ -1390,7 +1524,7 @@
         <w:drawing>
           <wp:inline xmlns:a="http://schemas.openxmlformats.org/drawingml/2006/main" xmlns:pic="http://schemas.openxmlformats.org/drawingml/2006/picture">
             <wp:extent cx="5760000" cy="3795022"/>
-            <wp:docPr id="5" name="Picture 5"/>
+            <wp:docPr id="6" name="Picture 6"/>
             <wp:cNvGraphicFramePr>
               <a:graphicFrameLocks noChangeAspect="1"/>
             </wp:cNvGraphicFramePr>
@@ -1402,7 +1536,7 @@
                     <pic:cNvPicPr/>
                   </pic:nvPicPr>
                   <pic:blipFill>
-                    <a:blip r:embed="rId14"/>
+                    <a:blip r:embed="rId15"/>
                     <a:stretch>
                       <a:fillRect/>
                     </a:stretch>
@@ -1432,7 +1566,7 @@
           <w:color w:val="666666"/>
           <w:sz w:val="19"/>
         </w:rPr>
-        <w:t>Figure 5 — The main screen (Dashboard).</w:t>
+        <w:t>Figure 6 — The main screen (Dashboard).</w:t>
       </w:r>
     </w:p>
     <w:tbl>
@@ -1474,7 +1608,7 @@
         <w:pStyle w:val="Heading1"/>
       </w:pPr>
       <w:r>
-        <w:t>7.  The sample class (Demo School)</w:t>
+        <w:t>7.  The sample class (Demo School) — only if you ask for it</w:t>
       </w:r>
     </w:p>
     <w:p>
@@ -1486,7 +1620,7 @@
           <w:b w:val="0"/>
           <w:i w:val="0"/>
         </w:rPr>
-        <w:t>When you sign in for the very first time, the app opens with a sample class: “Demo School · Sample Class 4B”. It has 12 pretend students and two semesters of marks. It is there so you can press every button and learn safely, before you add your real class.</w:t>
+        <w:t>The app does not put any class in front of you. When you start, you choose (section 4, Step 4). If you click “Load sample data”, you get a pretend class: “Demo School · Sample Class 4B”, with 12 pretend students and two semesters of marks (Sample 2025 Fall and Sample 2026 Spring). It is there so you can press every button and learn safely, before you add your real class.</w:t>
       </w:r>
     </w:p>
     <w:p>
@@ -1498,7 +1632,7 @@
           <w:b w:val="0"/>
           <w:i w:val="0"/>
         </w:rPr>
-        <w:t>When you are ready for your real class, go to Manage &amp; setup (see section 14) and either:</w:t>
+        <w:t>The pretend class is not connected to your work in any way. When you are ready for your real class, go to Manage &amp; setup (see section 14) and either:</w:t>
       </w:r>
     </w:p>
     <w:p>
@@ -1507,7 +1641,7 @@
         <w:spacing w:after="60"/>
       </w:pPr>
       <w:r>
-        <w:t>Click “New class / semester” to create your real class, then delete the sample semesters, or</w:t>
+        <w:t>Click “New class / semester” to create your real class, then delete the sample semesters (each semester card has a “Delete” button), or</w:t>
       </w:r>
     </w:p>
     <w:p>
@@ -1616,7 +1750,7 @@
         <w:drawing>
           <wp:inline xmlns:a="http://schemas.openxmlformats.org/drawingml/2006/main" xmlns:pic="http://schemas.openxmlformats.org/drawingml/2006/picture">
             <wp:extent cx="5760000" cy="3795022"/>
-            <wp:docPr id="6" name="Picture 6"/>
+            <wp:docPr id="7" name="Picture 7"/>
             <wp:cNvGraphicFramePr>
               <a:graphicFrameLocks noChangeAspect="1"/>
             </wp:cNvGraphicFramePr>
@@ -1625,79 +1759,6 @@
                 <pic:pic>
                   <pic:nvPicPr>
                     <pic:cNvPr id="0" name="20_dashboard_overview.png"/>
-                    <pic:cNvPicPr/>
-                  </pic:nvPicPr>
-                  <pic:blipFill>
-                    <a:blip r:embed="rId14"/>
-                    <a:stretch>
-                      <a:fillRect/>
-                    </a:stretch>
-                  </pic:blipFill>
-                  <pic:spPr>
-                    <a:xfrm>
-                      <a:off x="0" y="0"/>
-                      <a:ext cx="5760000" cy="3795022"/>
-                    </a:xfrm>
-                    <a:prstGeom prst="rect"/>
-                  </pic:spPr>
-                </pic:pic>
-              </a:graphicData>
-            </a:graphic>
-          </wp:inline>
-        </w:drawing>
-      </w:r>
-    </w:p>
-    <w:p>
-      <w:pPr>
-        <w:spacing w:after="200"/>
-        <w:jc w:val="center"/>
-      </w:pPr>
-      <w:r>
-        <w:rPr>
-          <w:i/>
-          <w:color w:val="666666"/>
-          <w:sz w:val="19"/>
-        </w:rPr>
-        <w:t>Figure 6 — Dashboard, Overview tab.</w:t>
-      </w:r>
-    </w:p>
-    <w:p>
-      <w:pPr>
-        <w:pStyle w:val="Heading2"/>
-      </w:pPr>
-      <w:r>
-        <w:t>8.2  Assessment evidence</w:t>
-      </w:r>
-    </w:p>
-    <w:p>
-      <w:pPr>
-        <w:spacing w:after="120"/>
-      </w:pPr>
-      <w:r>
-        <w:rPr>
-          <w:b w:val="0"/>
-          <w:i w:val="0"/>
-        </w:rPr>
-        <w:t>This tab shows, for every student, how much data you have recorded: complete, provisional (for example 7/9 components) or not yet assessed. Missing data is never treated as low marks — a final grade only appears when a student has at least 6 of the 9 components.</w:t>
-      </w:r>
-    </w:p>
-    <w:p>
-      <w:pPr>
-        <w:jc w:val="center"/>
-      </w:pPr>
-      <w:r>
-        <w:drawing>
-          <wp:inline xmlns:a="http://schemas.openxmlformats.org/drawingml/2006/main" xmlns:pic="http://schemas.openxmlformats.org/drawingml/2006/picture">
-            <wp:extent cx="5760000" cy="3795022"/>
-            <wp:docPr id="7" name="Picture 7"/>
-            <wp:cNvGraphicFramePr>
-              <a:graphicFrameLocks noChangeAspect="1"/>
-            </wp:cNvGraphicFramePr>
-            <a:graphic>
-              <a:graphicData uri="http://schemas.openxmlformats.org/drawingml/2006/picture">
-                <pic:pic>
-                  <pic:nvPicPr>
-                    <pic:cNvPr id="0" name="21_dashboard_evidence.png"/>
                     <pic:cNvPicPr/>
                   </pic:nvPicPr>
                   <pic:blipFill>
@@ -1731,7 +1792,7 @@
           <w:color w:val="666666"/>
           <w:sz w:val="19"/>
         </w:rPr>
-        <w:t>Figure 7 — Dashboard, Assessment evidence tab.</w:t>
+        <w:t>Figure 7 — Dashboard, Overview tab.</w:t>
       </w:r>
     </w:p>
     <w:p>
@@ -1739,7 +1800,7 @@
         <w:pStyle w:val="Heading2"/>
       </w:pPr>
       <w:r>
-        <w:t>8.3  Teaching priorities</w:t>
+        <w:t>8.2  Assessment evidence</w:t>
       </w:r>
     </w:p>
     <w:p>
@@ -1751,7 +1812,7 @@
           <w:b w:val="0"/>
           <w:i w:val="0"/>
         </w:rPr>
-        <w:t>This tab helps you plan teaching. It shows the weakest skills first (only when at least 5 students have marks), suggests a teaching action for each, and lists the students who need focused support, with a suggested action for each one.</w:t>
+        <w:t>This tab shows, for every student, how much data you have recorded: complete, provisional (for example 7/9 components) or not yet assessed. Missing data is never treated as low marks — a final grade only appears when a student has at least 6 of the 9 components.</w:t>
       </w:r>
     </w:p>
     <w:p>
@@ -1770,7 +1831,7 @@
               <a:graphicData uri="http://schemas.openxmlformats.org/drawingml/2006/picture">
                 <pic:pic>
                   <pic:nvPicPr>
-                    <pic:cNvPr id="0" name="22_dashboard_priorities.png"/>
+                    <pic:cNvPr id="0" name="21_dashboard_evidence.png"/>
                     <pic:cNvPicPr/>
                   </pic:nvPicPr>
                   <pic:blipFill>
@@ -1804,7 +1865,7 @@
           <w:color w:val="666666"/>
           <w:sz w:val="19"/>
         </w:rPr>
-        <w:t>Figure 8 — Dashboard, Teaching priorities tab.</w:t>
+        <w:t>Figure 8 — Dashboard, Assessment evidence tab.</w:t>
       </w:r>
     </w:p>
     <w:p>
@@ -1812,7 +1873,7 @@
         <w:pStyle w:val="Heading2"/>
       </w:pPr>
       <w:r>
-        <w:t>8.4  Advanced analysis</w:t>
+        <w:t>8.3  Teaching priorities</w:t>
       </w:r>
     </w:p>
     <w:p>
@@ -1824,7 +1885,7 @@
           <w:b w:val="0"/>
           <w:i w:val="0"/>
         </w:rPr>
-        <w:t>This tab shows scatter charts (for example: current score against change since last semester). It is for your own review — the app reminds you it does not measure ability by itself.</w:t>
+        <w:t>This tab helps you plan teaching. It shows the weakest skills first (only when at least 5 students have marks), suggests a teaching action for each, and lists the students who need focused support, with a suggested action for each one.</w:t>
       </w:r>
     </w:p>
     <w:p>
@@ -1843,7 +1904,7 @@
               <a:graphicData uri="http://schemas.openxmlformats.org/drawingml/2006/picture">
                 <pic:pic>
                   <pic:nvPicPr>
-                    <pic:cNvPr id="0" name="23_dashboard_advanced.png"/>
+                    <pic:cNvPr id="0" name="22_dashboard_priorities.png"/>
                     <pic:cNvPicPr/>
                   </pic:nvPicPr>
                   <pic:blipFill>
@@ -1877,15 +1938,15 @@
           <w:color w:val="666666"/>
           <w:sz w:val="19"/>
         </w:rPr>
-        <w:t>Figure 9 — Dashboard, Advanced analysis tab.</w:t>
+        <w:t>Figure 9 — Dashboard, Teaching priorities tab.</w:t>
       </w:r>
     </w:p>
     <w:p>
       <w:pPr>
-        <w:pStyle w:val="Heading1"/>
+        <w:pStyle w:val="Heading2"/>
       </w:pPr>
       <w:r>
-        <w:t>9.  Students — your class list</w:t>
+        <w:t>8.4  Advanced analysis</w:t>
       </w:r>
     </w:p>
     <w:p>
@@ -1897,34 +1958,7 @@
           <w:b w:val="0"/>
           <w:i w:val="0"/>
         </w:rPr>
-        <w:t>The Students page shows one card per student: photo-style badge with the family name, Chinese and English name, student ID, the current grade letter (or how many components are recorded, like 7/9), and a small trend line.</w:t>
-      </w:r>
-    </w:p>
-    <w:p>
-      <w:pPr>
-        <w:pStyle w:val="ListNumber"/>
-        <w:spacing w:after="60"/>
-      </w:pPr>
-      <w:r>
-        <w:t>Use the search box (top right) to find a student by name or ID.</w:t>
-      </w:r>
-    </w:p>
-    <w:p>
-      <w:pPr>
-        <w:pStyle w:val="ListNumber"/>
-        <w:spacing w:after="60"/>
-      </w:pPr>
-      <w:r>
-        <w:t>Click a student card to open their full performance profile (the “Student deep-dive”, see section 12.2).</w:t>
-      </w:r>
-    </w:p>
-    <w:p>
-      <w:pPr>
-        <w:pStyle w:val="ListNumber"/>
-        <w:spacing w:after="60"/>
-      </w:pPr>
-      <w:r>
-        <w:t>To add or remove students, go to Manage &amp; setup (section 14).</w:t>
+        <w:t>This tab shows scatter charts (for example: current score against change since last semester). It is for your own review — the app reminds you it does not measure ability by itself.</w:t>
       </w:r>
     </w:p>
     <w:p>
@@ -1943,7 +1977,7 @@
               <a:graphicData uri="http://schemas.openxmlformats.org/drawingml/2006/picture">
                 <pic:pic>
                   <pic:nvPicPr>
-                    <pic:cNvPr id="0" name="30_students.png"/>
+                    <pic:cNvPr id="0" name="23_dashboard_advanced.png"/>
                     <pic:cNvPicPr/>
                   </pic:nvPicPr>
                   <pic:blipFill>
@@ -1977,7 +2011,107 @@
           <w:color w:val="666666"/>
           <w:sz w:val="19"/>
         </w:rPr>
-        <w:t>Figure 10 — The Students page.</w:t>
+        <w:t>Figure 10 — Dashboard, Advanced analysis tab.</w:t>
+      </w:r>
+    </w:p>
+    <w:p>
+      <w:pPr>
+        <w:pStyle w:val="Heading1"/>
+      </w:pPr>
+      <w:r>
+        <w:t>9.  Students — your class list</w:t>
+      </w:r>
+    </w:p>
+    <w:p>
+      <w:pPr>
+        <w:spacing w:after="120"/>
+      </w:pPr>
+      <w:r>
+        <w:rPr>
+          <w:b w:val="0"/>
+          <w:i w:val="0"/>
+        </w:rPr>
+        <w:t>The Students page shows one card per student: photo-style badge with the family name, Chinese and English name, student ID, the current grade letter (or how many components are recorded, like 7/9), and a small trend line.</w:t>
+      </w:r>
+    </w:p>
+    <w:p>
+      <w:pPr>
+        <w:pStyle w:val="ListNumber"/>
+        <w:spacing w:after="60"/>
+      </w:pPr>
+      <w:r>
+        <w:t>Use the search box (top right) to find a student by name or ID.</w:t>
+      </w:r>
+    </w:p>
+    <w:p>
+      <w:pPr>
+        <w:pStyle w:val="ListNumber"/>
+        <w:spacing w:after="60"/>
+      </w:pPr>
+      <w:r>
+        <w:t>Click a student card to open their full performance profile (the “Student deep-dive”, see section 12.2).</w:t>
+      </w:r>
+    </w:p>
+    <w:p>
+      <w:pPr>
+        <w:pStyle w:val="ListNumber"/>
+        <w:spacing w:after="60"/>
+      </w:pPr>
+      <w:r>
+        <w:t>To add or remove students, go to Manage &amp; setup (section 14).</w:t>
+      </w:r>
+    </w:p>
+    <w:p>
+      <w:pPr>
+        <w:jc w:val="center"/>
+      </w:pPr>
+      <w:r>
+        <w:drawing>
+          <wp:inline xmlns:a="http://schemas.openxmlformats.org/drawingml/2006/main" xmlns:pic="http://schemas.openxmlformats.org/drawingml/2006/picture">
+            <wp:extent cx="5760000" cy="3795022"/>
+            <wp:docPr id="11" name="Picture 11"/>
+            <wp:cNvGraphicFramePr>
+              <a:graphicFrameLocks noChangeAspect="1"/>
+            </wp:cNvGraphicFramePr>
+            <a:graphic>
+              <a:graphicData uri="http://schemas.openxmlformats.org/drawingml/2006/picture">
+                <pic:pic>
+                  <pic:nvPicPr>
+                    <pic:cNvPr id="0" name="30_students.png"/>
+                    <pic:cNvPicPr/>
+                  </pic:nvPicPr>
+                  <pic:blipFill>
+                    <a:blip r:embed="rId19"/>
+                    <a:stretch>
+                      <a:fillRect/>
+                    </a:stretch>
+                  </pic:blipFill>
+                  <pic:spPr>
+                    <a:xfrm>
+                      <a:off x="0" y="0"/>
+                      <a:ext cx="5760000" cy="3795022"/>
+                    </a:xfrm>
+                    <a:prstGeom prst="rect"/>
+                  </pic:spPr>
+                </pic:pic>
+              </a:graphicData>
+            </a:graphic>
+          </wp:inline>
+        </w:drawing>
+      </w:r>
+    </w:p>
+    <w:p>
+      <w:pPr>
+        <w:spacing w:after="200"/>
+        <w:jc w:val="center"/>
+      </w:pPr>
+      <w:r>
+        <w:rPr>
+          <w:i/>
+          <w:color w:val="666666"/>
+          <w:sz w:val="19"/>
+        </w:rPr>
+        <w:t>Figure 11 — The Students page.</w:t>
       </w:r>
     </w:p>
     <w:p>
@@ -2291,7 +2425,7 @@
         <w:drawing>
           <wp:inline xmlns:a="http://schemas.openxmlformats.org/drawingml/2006/main" xmlns:pic="http://schemas.openxmlformats.org/drawingml/2006/picture">
             <wp:extent cx="5760000" cy="3795022"/>
-            <wp:docPr id="11" name="Picture 11"/>
+            <wp:docPr id="12" name="Picture 12"/>
             <wp:cNvGraphicFramePr>
               <a:graphicFrameLocks noChangeAspect="1"/>
             </wp:cNvGraphicFramePr>
@@ -2300,79 +2434,6 @@
                 <pic:pic>
                   <pic:nvPicPr>
                     <pic:cNvPr id="0" name="40_enter_scores.png"/>
-                    <pic:cNvPicPr/>
-                  </pic:nvPicPr>
-                  <pic:blipFill>
-                    <a:blip r:embed="rId19"/>
-                    <a:stretch>
-                      <a:fillRect/>
-                    </a:stretch>
-                  </pic:blipFill>
-                  <pic:spPr>
-                    <a:xfrm>
-                      <a:off x="0" y="0"/>
-                      <a:ext cx="5760000" cy="3795022"/>
-                    </a:xfrm>
-                    <a:prstGeom prst="rect"/>
-                  </pic:spPr>
-                </pic:pic>
-              </a:graphicData>
-            </a:graphic>
-          </wp:inline>
-        </w:drawing>
-      </w:r>
-    </w:p>
-    <w:p>
-      <w:pPr>
-        <w:spacing w:after="200"/>
-        <w:jc w:val="center"/>
-      </w:pPr>
-      <w:r>
-        <w:rPr>
-          <w:i/>
-          <w:color w:val="666666"/>
-          <w:sz w:val="19"/>
-        </w:rPr>
-        <w:t>Figure 11 — Enter scores, Spelling tab. Weeks 1–5, then Month average and Semester average.</w:t>
-      </w:r>
-    </w:p>
-    <w:p>
-      <w:pPr>
-        <w:pStyle w:val="Heading2"/>
-      </w:pPr>
-      <w:r>
-        <w:t>10.1  Observations tab</w:t>
-      </w:r>
-    </w:p>
-    <w:p>
-      <w:pPr>
-        <w:spacing w:after="120"/>
-      </w:pPr>
-      <w:r>
-        <w:rPr>
-          <w:b w:val="0"/>
-          <w:i w:val="0"/>
-        </w:rPr>
-        <w:t>The Observations tab records listening, speaking, writing and reading. Each skill has two observation columns (LO1, LO2), each out of 10. If you are not sure what LO1 and LO2 mean for your school, click the question “What do LO1 / LO2 mean?” at the top of the table.</w:t>
-      </w:r>
-    </w:p>
-    <w:p>
-      <w:pPr>
-        <w:jc w:val="center"/>
-      </w:pPr>
-      <w:r>
-        <w:drawing>
-          <wp:inline xmlns:a="http://schemas.openxmlformats.org/drawingml/2006/main" xmlns:pic="http://schemas.openxmlformats.org/drawingml/2006/picture">
-            <wp:extent cx="5760000" cy="3795022"/>
-            <wp:docPr id="12" name="Picture 12"/>
-            <wp:cNvGraphicFramePr>
-              <a:graphicFrameLocks noChangeAspect="1"/>
-            </wp:cNvGraphicFramePr>
-            <a:graphic>
-              <a:graphicData uri="http://schemas.openxmlformats.org/drawingml/2006/picture">
-                <pic:pic>
-                  <pic:nvPicPr>
-                    <pic:cNvPr id="0" name="41_scores_observations.png"/>
                     <pic:cNvPicPr/>
                   </pic:nvPicPr>
                   <pic:blipFill>
@@ -2406,7 +2467,7 @@
           <w:color w:val="666666"/>
           <w:sz w:val="19"/>
         </w:rPr>
-        <w:t>Figure 12 — Observations tab: four skills with LO1 and LO2 marks.</w:t>
+        <w:t>Figure 12 — Enter scores, Spelling tab. Weeks 1–5, then Month average and Semester average.</w:t>
       </w:r>
     </w:p>
     <w:p>
@@ -2414,7 +2475,19 @@
         <w:pStyle w:val="Heading2"/>
       </w:pPr>
       <w:r>
-        <w:t>10.2  Daily assignment tab</w:t>
+        <w:t>10.1  Observations tab</w:t>
+      </w:r>
+    </w:p>
+    <w:p>
+      <w:pPr>
+        <w:spacing w:after="120"/>
+      </w:pPr>
+      <w:r>
+        <w:rPr>
+          <w:b w:val="0"/>
+          <w:i w:val="0"/>
+        </w:rPr>
+        <w:t>The Observations tab records listening, speaking, writing and reading. Each skill has two observation columns (LO1, LO2), each out of 10. If you are not sure what LO1 and LO2 mean for your school, click the question “What do LO1 / LO2 mean?” at the top of the table.</w:t>
       </w:r>
     </w:p>
     <w:p>
@@ -2433,7 +2506,7 @@
               <a:graphicData uri="http://schemas.openxmlformats.org/drawingml/2006/picture">
                 <pic:pic>
                   <pic:nvPicPr>
-                    <pic:cNvPr id="0" name="43_scores_daily.png"/>
+                    <pic:cNvPr id="0" name="41_scores_observations.png"/>
                     <pic:cNvPicPr/>
                   </pic:nvPicPr>
                   <pic:blipFill>
@@ -2467,7 +2540,7 @@
           <w:color w:val="666666"/>
           <w:sz w:val="19"/>
         </w:rPr>
-        <w:t>Figure 13 — Daily assignment tab: weekly marks with a total.</w:t>
+        <w:t>Figure 13 — Observations tab: four skills with LO1 and LO2 marks.</w:t>
       </w:r>
     </w:p>
     <w:p>
@@ -2475,19 +2548,7 @@
         <w:pStyle w:val="Heading2"/>
       </w:pPr>
       <w:r>
-        <w:t>10.3  Tests tab</w:t>
-      </w:r>
-    </w:p>
-    <w:p>
-      <w:pPr>
-        <w:spacing w:after="120"/>
-      </w:pPr>
-      <w:r>
-        <w:rPr>
-          <w:b w:val="0"/>
-          <w:i w:val="0"/>
-        </w:rPr>
-        <w:t>The Tests tab has three exams: Mid-Term, Oral and Written. Type the score and the total for each. The “Weighted final” line shows the exam-part grade. Remember: the Written exam counts 20% in the final grade; every other part counts 10%.</w:t>
+        <w:t>10.2  Daily assignment tab</w:t>
       </w:r>
     </w:p>
     <w:p>
@@ -2506,7 +2567,7 @@
               <a:graphicData uri="http://schemas.openxmlformats.org/drawingml/2006/picture">
                 <pic:pic>
                   <pic:nvPicPr>
-                    <pic:cNvPr id="0" name="44_scores_tests.png"/>
+                    <pic:cNvPr id="0" name="43_scores_daily.png"/>
                     <pic:cNvPicPr/>
                   </pic:nvPicPr>
                   <pic:blipFill>
@@ -2540,7 +2601,7 @@
           <w:color w:val="666666"/>
           <w:sz w:val="19"/>
         </w:rPr>
-        <w:t>Figure 14 — Tests tab: Mid-Term, Oral and Written.</w:t>
+        <w:t>Figure 14 — Daily assignment tab: weekly marks with a total.</w:t>
       </w:r>
     </w:p>
     <w:p>
@@ -2548,51 +2609,7 @@
         <w:pStyle w:val="Heading2"/>
       </w:pPr>
       <w:r>
-        <w:t>10.4  Good to know</w:t>
-      </w:r>
-    </w:p>
-    <w:p>
-      <w:pPr>
-        <w:pStyle w:val="ListBullet"/>
-        <w:spacing w:after="60"/>
-      </w:pPr>
-      <w:r>
-        <w:t>Copy from Excel: you can copy a block of numbers in Microsoft Excel and paste it straight into the grid.</w:t>
-      </w:r>
-    </w:p>
-    <w:p>
-      <w:pPr>
-        <w:pStyle w:val="ListBullet"/>
-        <w:spacing w:after="60"/>
-      </w:pPr>
-      <w:r>
-        <w:t>Auto-fill totals: in Manage &amp; setup → Settings you can turn on “auto-fill totals”, so the total (20 or 10) is filled for you.</w:t>
-      </w:r>
-    </w:p>
-    <w:p>
-      <w:pPr>
-        <w:pStyle w:val="ListBullet"/>
-        <w:spacing w:after="60"/>
-      </w:pPr>
-      <w:r>
-        <w:t>Colours: the table uses colour to warn you — red usually means a low mark or a missing mark.</w:t>
-      </w:r>
-    </w:p>
-    <w:p>
-      <w:pPr>
-        <w:pStyle w:val="ListBullet"/>
-        <w:spacing w:after="60"/>
-      </w:pPr>
-      <w:r>
-        <w:t>The last row of each table shows the class average, so you can spot students far below it.</w:t>
-      </w:r>
-    </w:p>
-    <w:p>
-      <w:pPr>
-        <w:pStyle w:val="Heading1"/>
-      </w:pPr>
-      <w:r>
-        <w:t>11.  Grading — how grades are calculated</w:t>
+        <w:t>10.3  Tests tab</w:t>
       </w:r>
     </w:p>
     <w:p>
@@ -2604,7 +2621,7 @@
           <w:b w:val="0"/>
           <w:i w:val="0"/>
         </w:rPr>
-        <w:t>The Grading page shows one big table: every student, every component, the final percentage and the grade letter. You do not calculate anything — the app does it as soon as you type marks.</w:t>
+        <w:t>The Tests tab has three exams: Mid-Term, Oral and Written. Type the score and the total for each. The “Weighted final” line shows the exam-part grade. Remember: the Written exam counts 20% in the final grade; every other part counts 10%.</w:t>
       </w:r>
     </w:p>
     <w:p>
@@ -2623,7 +2640,7 @@
               <a:graphicData uri="http://schemas.openxmlformats.org/drawingml/2006/picture">
                 <pic:pic>
                   <pic:nvPicPr>
-                    <pic:cNvPr id="0" name="50_grading.png"/>
+                    <pic:cNvPr id="0" name="44_scores_tests.png"/>
                     <pic:cNvPicPr/>
                   </pic:nvPicPr>
                   <pic:blipFill>
@@ -2657,7 +2674,124 @@
           <w:color w:val="666666"/>
           <w:sz w:val="19"/>
         </w:rPr>
-        <w:t>Figure 15 — The Grading table. The formula is printed at the bottom of the page.</w:t>
+        <w:t>Figure 15 — Tests tab: Mid-Term, Oral and Written.</w:t>
+      </w:r>
+    </w:p>
+    <w:p>
+      <w:pPr>
+        <w:pStyle w:val="Heading2"/>
+      </w:pPr>
+      <w:r>
+        <w:t>10.4  Good to know</w:t>
+      </w:r>
+    </w:p>
+    <w:p>
+      <w:pPr>
+        <w:pStyle w:val="ListBullet"/>
+        <w:spacing w:after="60"/>
+      </w:pPr>
+      <w:r>
+        <w:t>Copy from Excel: you can copy a block of numbers in Microsoft Excel and paste it straight into the grid.</w:t>
+      </w:r>
+    </w:p>
+    <w:p>
+      <w:pPr>
+        <w:pStyle w:val="ListBullet"/>
+        <w:spacing w:after="60"/>
+      </w:pPr>
+      <w:r>
+        <w:t>Auto-fill totals: in Manage &amp; setup → Settings you can turn on “auto-fill totals”, so the total (20 or 10) is filled for you.</w:t>
+      </w:r>
+    </w:p>
+    <w:p>
+      <w:pPr>
+        <w:pStyle w:val="ListBullet"/>
+        <w:spacing w:after="60"/>
+      </w:pPr>
+      <w:r>
+        <w:t>Colours: the table uses colour to warn you — red usually means a low mark or a missing mark.</w:t>
+      </w:r>
+    </w:p>
+    <w:p>
+      <w:pPr>
+        <w:pStyle w:val="ListBullet"/>
+        <w:spacing w:after="60"/>
+      </w:pPr>
+      <w:r>
+        <w:t>The last row of each table shows the class average, so you can spot students far below it.</w:t>
+      </w:r>
+    </w:p>
+    <w:p>
+      <w:pPr>
+        <w:pStyle w:val="Heading1"/>
+      </w:pPr>
+      <w:r>
+        <w:t>11.  Grading — how grades are calculated</w:t>
+      </w:r>
+    </w:p>
+    <w:p>
+      <w:pPr>
+        <w:spacing w:after="120"/>
+      </w:pPr>
+      <w:r>
+        <w:rPr>
+          <w:b w:val="0"/>
+          <w:i w:val="0"/>
+        </w:rPr>
+        <w:t>The Grading page shows one big table: every student, every component, the final percentage and the grade letter. You do not calculate anything — the app does it as soon as you type marks.</w:t>
+      </w:r>
+    </w:p>
+    <w:p>
+      <w:pPr>
+        <w:jc w:val="center"/>
+      </w:pPr>
+      <w:r>
+        <w:drawing>
+          <wp:inline xmlns:a="http://schemas.openxmlformats.org/drawingml/2006/main" xmlns:pic="http://schemas.openxmlformats.org/drawingml/2006/picture">
+            <wp:extent cx="5760000" cy="3795022"/>
+            <wp:docPr id="16" name="Picture 16"/>
+            <wp:cNvGraphicFramePr>
+              <a:graphicFrameLocks noChangeAspect="1"/>
+            </wp:cNvGraphicFramePr>
+            <a:graphic>
+              <a:graphicData uri="http://schemas.openxmlformats.org/drawingml/2006/picture">
+                <pic:pic>
+                  <pic:nvPicPr>
+                    <pic:cNvPr id="0" name="50_grading.png"/>
+                    <pic:cNvPicPr/>
+                  </pic:nvPicPr>
+                  <pic:blipFill>
+                    <a:blip r:embed="rId24"/>
+                    <a:stretch>
+                      <a:fillRect/>
+                    </a:stretch>
+                  </pic:blipFill>
+                  <pic:spPr>
+                    <a:xfrm>
+                      <a:off x="0" y="0"/>
+                      <a:ext cx="5760000" cy="3795022"/>
+                    </a:xfrm>
+                    <a:prstGeom prst="rect"/>
+                  </pic:spPr>
+                </pic:pic>
+              </a:graphicData>
+            </a:graphic>
+          </wp:inline>
+        </w:drawing>
+      </w:r>
+    </w:p>
+    <w:p>
+      <w:pPr>
+        <w:spacing w:after="200"/>
+        <w:jc w:val="center"/>
+      </w:pPr>
+      <w:r>
+        <w:rPr>
+          <w:i/>
+          <w:color w:val="666666"/>
+          <w:sz w:val="19"/>
+        </w:rPr>
+        <w:t>Figure 16 — The Grading table. The formula is printed at the bottom of the page.</w:t>
       </w:r>
     </w:p>
     <w:p>
@@ -3374,7 +3508,7 @@
         <w:drawing>
           <wp:inline xmlns:a="http://schemas.openxmlformats.org/drawingml/2006/main" xmlns:pic="http://schemas.openxmlformats.org/drawingml/2006/picture">
             <wp:extent cx="5760000" cy="5363631"/>
-            <wp:docPr id="16" name="Picture 16"/>
+            <wp:docPr id="17" name="Picture 17"/>
             <wp:cNvGraphicFramePr>
               <a:graphicFrameLocks noChangeAspect="1"/>
             </wp:cNvGraphicFramePr>
@@ -3386,7 +3520,7 @@
                     <pic:cNvPicPr/>
                   </pic:nvPicPr>
                   <pic:blipFill>
-                    <a:blip r:embed="rId24"/>
+                    <a:blip r:embed="rId25"/>
                     <a:stretch>
                       <a:fillRect/>
                     </a:stretch>
@@ -3416,7 +3550,7 @@
           <w:color w:val="666666"/>
           <w:sz w:val="19"/>
         </w:rPr>
-        <w:t>Figure 16 — Analysis, Class progress tab.</w:t>
+        <w:t>Figure 17 — Analysis, Class progress tab.</w:t>
       </w:r>
     </w:p>
     <w:p>
@@ -3465,7 +3599,7 @@
         <w:drawing>
           <wp:inline xmlns:a="http://schemas.openxmlformats.org/drawingml/2006/main" xmlns:pic="http://schemas.openxmlformats.org/drawingml/2006/picture">
             <wp:extent cx="5760000" cy="6675022"/>
-            <wp:docPr id="17" name="Picture 17"/>
+            <wp:docPr id="18" name="Picture 18"/>
             <wp:cNvGraphicFramePr>
               <a:graphicFrameLocks noChangeAspect="1"/>
             </wp:cNvGraphicFramePr>
@@ -3477,7 +3611,7 @@
                     <pic:cNvPicPr/>
                   </pic:nvPicPr>
                   <pic:blipFill>
-                    <a:blip r:embed="rId25"/>
+                    <a:blip r:embed="rId26"/>
                     <a:stretch>
                       <a:fillRect/>
                     </a:stretch>
@@ -3507,7 +3641,7 @@
           <w:color w:val="666666"/>
           <w:sz w:val="19"/>
         </w:rPr>
-        <w:t>Figure 17 — Student deep-dive: charts, matrix and automatic findings.</w:t>
+        <w:t>Figure 18 — Student deep-dive: charts, matrix and automatic findings.</w:t>
       </w:r>
     </w:p>
     <w:p>
@@ -3558,7 +3692,7 @@
         <w:drawing>
           <wp:inline xmlns:a="http://schemas.openxmlformats.org/drawingml/2006/main" xmlns:pic="http://schemas.openxmlformats.org/drawingml/2006/picture">
             <wp:extent cx="5760000" cy="6299736"/>
-            <wp:docPr id="18" name="Picture 18"/>
+            <wp:docPr id="19" name="Picture 19"/>
             <wp:cNvGraphicFramePr>
               <a:graphicFrameLocks noChangeAspect="1"/>
             </wp:cNvGraphicFramePr>
@@ -3570,7 +3704,7 @@
                     <pic:cNvPicPr/>
                   </pic:nvPicPr>
                   <pic:blipFill>
-                    <a:blip r:embed="rId26"/>
+                    <a:blip r:embed="rId27"/>
                     <a:stretch>
                       <a:fillRect/>
                     </a:stretch>
@@ -3600,7 +3734,7 @@
           <w:color w:val="666666"/>
           <w:sz w:val="19"/>
         </w:rPr>
-        <w:t>Figure 18 — Report Cards, Class report tab.</w:t>
+        <w:t>Figure 19 — Report Cards, Class report tab.</w:t>
       </w:r>
     </w:p>
     <w:p>
@@ -3676,7 +3810,7 @@
         <w:drawing>
           <wp:inline xmlns:a="http://schemas.openxmlformats.org/drawingml/2006/main" xmlns:pic="http://schemas.openxmlformats.org/drawingml/2006/picture">
             <wp:extent cx="5030479" cy="7380000"/>
-            <wp:docPr id="19" name="Picture 19"/>
+            <wp:docPr id="20" name="Picture 20"/>
             <wp:cNvGraphicFramePr>
               <a:graphicFrameLocks noChangeAspect="1"/>
             </wp:cNvGraphicFramePr>
@@ -3688,7 +3822,7 @@
                     <pic:cNvPicPr/>
                   </pic:nvPicPr>
                   <pic:blipFill>
-                    <a:blip r:embed="rId27"/>
+                    <a:blip r:embed="rId28"/>
                     <a:stretch>
                       <a:fillRect/>
                     </a:stretch>
@@ -3718,7 +3852,7 @@
           <w:color w:val="666666"/>
           <w:sz w:val="19"/>
         </w:rPr>
-        <w:t>Figure 19 — A student's report card with the comment boxes above it.</w:t>
+        <w:t>Figure 20 — A student's report card with the comment boxes above it.</w:t>
       </w:r>
     </w:p>
     <w:p>
@@ -3749,7 +3883,7 @@
         <w:drawing>
           <wp:inline xmlns:a="http://schemas.openxmlformats.org/drawingml/2006/main" xmlns:pic="http://schemas.openxmlformats.org/drawingml/2006/picture">
             <wp:extent cx="5539054" cy="7379999"/>
-            <wp:docPr id="20" name="Picture 20"/>
+            <wp:docPr id="21" name="Picture 21"/>
             <wp:cNvGraphicFramePr>
               <a:graphicFrameLocks noChangeAspect="1"/>
             </wp:cNvGraphicFramePr>
@@ -3761,7 +3895,7 @@
                     <pic:cNvPicPr/>
                   </pic:nvPicPr>
                   <pic:blipFill>
-                    <a:blip r:embed="rId28"/>
+                    <a:blip r:embed="rId29"/>
                     <a:stretch>
                       <a:fillRect/>
                     </a:stretch>
@@ -3791,7 +3925,7 @@
           <w:color w:val="666666"/>
           <w:sz w:val="19"/>
         </w:rPr>
-        <w:t>Figure 20 — The Manage &amp; setup page.</w:t>
+        <w:t>Figure 21 — The Manage &amp; setup page.</w:t>
       </w:r>
     </w:p>
     <w:p>
@@ -3854,94 +3988,6 @@
       </w:pPr>
       <w:r>
         <w:t>Click “Create”. The new semester becomes your current one.</w:t>
-      </w:r>
-    </w:p>
-    <w:p>
-      <w:pPr>
-        <w:jc w:val="center"/>
-      </w:pPr>
-      <w:r>
-        <w:drawing>
-          <wp:inline xmlns:a="http://schemas.openxmlformats.org/drawingml/2006/main" xmlns:pic="http://schemas.openxmlformats.org/drawingml/2006/picture">
-            <wp:extent cx="5760000" cy="3795022"/>
-            <wp:docPr id="21" name="Picture 21"/>
-            <wp:cNvGraphicFramePr>
-              <a:graphicFrameLocks noChangeAspect="1"/>
-            </wp:cNvGraphicFramePr>
-            <a:graphic>
-              <a:graphicData uri="http://schemas.openxmlformats.org/drawingml/2006/picture">
-                <pic:pic>
-                  <pic:nvPicPr>
-                    <pic:cNvPr id="0" name="15_wizard_filled.png"/>
-                    <pic:cNvPicPr/>
-                  </pic:nvPicPr>
-                  <pic:blipFill>
-                    <a:blip r:embed="rId29"/>
-                    <a:stretch>
-                      <a:fillRect/>
-                    </a:stretch>
-                  </pic:blipFill>
-                  <pic:spPr>
-                    <a:xfrm>
-                      <a:off x="0" y="0"/>
-                      <a:ext cx="5760000" cy="3795022"/>
-                    </a:xfrm>
-                    <a:prstGeom prst="rect"/>
-                  </pic:spPr>
-                </pic:pic>
-              </a:graphicData>
-            </a:graphic>
-          </wp:inline>
-        </w:drawing>
-      </w:r>
-    </w:p>
-    <w:p>
-      <w:pPr>
-        <w:spacing w:after="200"/>
-        <w:jc w:val="center"/>
-      </w:pPr>
-      <w:r>
-        <w:rPr>
-          <w:i/>
-          <w:color w:val="666666"/>
-          <w:sz w:val="19"/>
-        </w:rPr>
-        <w:t>Figure 21 — The New class / semester window, filled in.</w:t>
-      </w:r>
-    </w:p>
-    <w:p>
-      <w:pPr>
-        <w:pStyle w:val="Heading2"/>
-      </w:pPr>
-      <w:r>
-        <w:t>14.2  Semester cards</w:t>
-      </w:r>
-    </w:p>
-    <w:p>
-      <w:pPr>
-        <w:pStyle w:val="ListBullet"/>
-        <w:spacing w:after="60"/>
-      </w:pPr>
-      <w:r>
-        <w:t>Each semester is a card. You can correct the name, school, class or teachers by typing in the box.</w:t>
-      </w:r>
-    </w:p>
-    <w:p>
-      <w:pPr>
-        <w:pStyle w:val="ListBullet"/>
-        <w:spacing w:after="60"/>
-      </w:pPr>
-      <w:r>
-        <w:t>“Make current” switches the whole app to that semester.</w:t>
-      </w:r>
-    </w:p>
-    <w:p>
-      <w:pPr>
-        <w:pStyle w:val="ListBullet"/>
-        <w:spacing w:after="60"/>
-      </w:pPr>
-      <w:r>
-        <w:t>“Delete” removes the semester and its scores. The app asks “Are you sure?” first and reminds you to make a backup.</w:t>
       </w:r>
     </w:p>
     <w:p>
@@ -3960,7 +4006,7 @@
               <a:graphicData uri="http://schemas.openxmlformats.org/drawingml/2006/picture">
                 <pic:pic>
                   <pic:nvPicPr>
-                    <pic:cNvPr id="0" name="17_undo_toast.png"/>
+                    <pic:cNvPr id="0" name="15_wizard_filled.png"/>
                     <pic:cNvPicPr/>
                   </pic:nvPicPr>
                   <pic:blipFill>
@@ -3994,7 +4040,95 @@
           <w:color w:val="666666"/>
           <w:sz w:val="19"/>
         </w:rPr>
-        <w:t>Figure 22 — Deleting always asks for confirmation first.</w:t>
+        <w:t>Figure 22 — The New class / semester window, filled in.</w:t>
+      </w:r>
+    </w:p>
+    <w:p>
+      <w:pPr>
+        <w:pStyle w:val="Heading2"/>
+      </w:pPr>
+      <w:r>
+        <w:t>14.2  Semester cards</w:t>
+      </w:r>
+    </w:p>
+    <w:p>
+      <w:pPr>
+        <w:pStyle w:val="ListBullet"/>
+        <w:spacing w:after="60"/>
+      </w:pPr>
+      <w:r>
+        <w:t>Each semester is a card. You can correct the name, school, class or teachers by typing in the box.</w:t>
+      </w:r>
+    </w:p>
+    <w:p>
+      <w:pPr>
+        <w:pStyle w:val="ListBullet"/>
+        <w:spacing w:after="60"/>
+      </w:pPr>
+      <w:r>
+        <w:t>“Make current” switches the whole app to that semester.</w:t>
+      </w:r>
+    </w:p>
+    <w:p>
+      <w:pPr>
+        <w:pStyle w:val="ListBullet"/>
+        <w:spacing w:after="60"/>
+      </w:pPr>
+      <w:r>
+        <w:t>“Delete” removes the semester and its scores. The app asks “Are you sure?” first and reminds you to make a backup.</w:t>
+      </w:r>
+    </w:p>
+    <w:p>
+      <w:pPr>
+        <w:jc w:val="center"/>
+      </w:pPr>
+      <w:r>
+        <w:drawing>
+          <wp:inline xmlns:a="http://schemas.openxmlformats.org/drawingml/2006/main" xmlns:pic="http://schemas.openxmlformats.org/drawingml/2006/picture">
+            <wp:extent cx="5760000" cy="3795022"/>
+            <wp:docPr id="23" name="Picture 23"/>
+            <wp:cNvGraphicFramePr>
+              <a:graphicFrameLocks noChangeAspect="1"/>
+            </wp:cNvGraphicFramePr>
+            <a:graphic>
+              <a:graphicData uri="http://schemas.openxmlformats.org/drawingml/2006/picture">
+                <pic:pic>
+                  <pic:nvPicPr>
+                    <pic:cNvPr id="0" name="17_undo_toast.png"/>
+                    <pic:cNvPicPr/>
+                  </pic:nvPicPr>
+                  <pic:blipFill>
+                    <a:blip r:embed="rId31"/>
+                    <a:stretch>
+                      <a:fillRect/>
+                    </a:stretch>
+                  </pic:blipFill>
+                  <pic:spPr>
+                    <a:xfrm>
+                      <a:off x="0" y="0"/>
+                      <a:ext cx="5760000" cy="3795022"/>
+                    </a:xfrm>
+                    <a:prstGeom prst="rect"/>
+                  </pic:spPr>
+                </pic:pic>
+              </a:graphicData>
+            </a:graphic>
+          </wp:inline>
+        </w:drawing>
+      </w:r>
+    </w:p>
+    <w:p>
+      <w:pPr>
+        <w:spacing w:after="200"/>
+        <w:jc w:val="center"/>
+      </w:pPr>
+      <w:r>
+        <w:rPr>
+          <w:i/>
+          <w:color w:val="666666"/>
+          <w:sz w:val="19"/>
+        </w:rPr>
+        <w:t>Figure 23 — Deleting always asks for confirmation first.</w:t>
       </w:r>
     </w:p>
     <w:p>
@@ -4395,7 +4529,7 @@
         <w:drawing>
           <wp:inline xmlns:a="http://schemas.openxmlformats.org/drawingml/2006/main" xmlns:pic="http://schemas.openxmlformats.org/drawingml/2006/picture">
             <wp:extent cx="5760000" cy="3795022"/>
-            <wp:docPr id="23" name="Picture 23"/>
+            <wp:docPr id="24" name="Picture 24"/>
             <wp:cNvGraphicFramePr>
               <a:graphicFrameLocks noChangeAspect="1"/>
             </wp:cNvGraphicFramePr>
@@ -4407,7 +4541,7 @@
                     <pic:cNvPicPr/>
                   </pic:nvPicPr>
                   <pic:blipFill>
-                    <a:blip r:embed="rId31"/>
+                    <a:blip r:embed="rId32"/>
                     <a:stretch>
                       <a:fillRect/>
                     </a:stretch>
@@ -4437,7 +4571,7 @@
           <w:color w:val="666666"/>
           <w:sz w:val="19"/>
         </w:rPr>
-        <w:t>Figure 23 — Import always shows what it will do before it does it.</w:t>
+        <w:t>Figure 24 — Import always shows what it will do before it does it.</w:t>
       </w:r>
     </w:p>
     <w:p>
@@ -4563,7 +4697,7 @@
         <w:drawing>
           <wp:inline xmlns:a="http://schemas.openxmlformats.org/drawingml/2006/main" xmlns:pic="http://schemas.openxmlformats.org/drawingml/2006/picture">
             <wp:extent cx="5760000" cy="3795022"/>
-            <wp:docPr id="24" name="Picture 24"/>
+            <wp:docPr id="25" name="Picture 25"/>
             <wp:cNvGraphicFramePr>
               <a:graphicFrameLocks noChangeAspect="1"/>
             </wp:cNvGraphicFramePr>
@@ -4575,7 +4709,7 @@
                     <pic:cNvPicPr/>
                   </pic:nvPicPr>
                   <pic:blipFill>
-                    <a:blip r:embed="rId32"/>
+                    <a:blip r:embed="rId33"/>
                     <a:stretch>
                       <a:fillRect/>
                     </a:stretch>
@@ -4605,7 +4739,7 @@
           <w:color w:val="666666"/>
           <w:sz w:val="19"/>
         </w:rPr>
-        <w:t>Figure 24 — The share window: link and QR code.</w:t>
+        <w:t>Figure 25 — The share window: link and QR code.</w:t>
       </w:r>
     </w:p>
     <w:p>
@@ -5165,6 +5299,46 @@
         <w:pStyle w:val="Heading2"/>
       </w:pPr>
       <w:r>
+        <w:t>I see “Set up your first class”. Where is my class?</w:t>
+      </w:r>
+    </w:p>
+    <w:p>
+      <w:pPr>
+        <w:spacing w:after="120"/>
+      </w:pPr>
+      <w:r>
+        <w:rPr>
+          <w:b w:val="0"/>
+          <w:i w:val="0"/>
+        </w:rPr>
+        <w:t>That screen appears when this browser has no class yet. It is the normal starting point: choose “New class (guided setup)” to begin (section 14.1), or “Import SPR Excel file” if you have a file, or “Load sample data” just to practise.</w:t>
+      </w:r>
+    </w:p>
+    <w:p>
+      <w:pPr>
+        <w:pStyle w:val="Heading2"/>
+      </w:pPr>
+      <w:r>
+        <w:t>How do I remove the pretend Demo School class?</w:t>
+      </w:r>
+    </w:p>
+    <w:p>
+      <w:pPr>
+        <w:spacing w:after="120"/>
+      </w:pPr>
+      <w:r>
+        <w:rPr>
+          <w:b w:val="0"/>
+          <w:i w:val="0"/>
+        </w:rPr>
+        <w:t>Manage &amp; setup → in the Semesters list, press “Delete” on each sample semester (Sample 2025 Fall, Sample 2026 Spring). Your own classes are not touched.</w:t>
+      </w:r>
+    </w:p>
+    <w:p>
+      <w:pPr>
+        <w:pStyle w:val="Heading2"/>
+      </w:pPr>
+      <w:r>
         <w:t>I forgot my password. What now?</w:t>
       </w:r>
     </w:p>
@@ -5197,7 +5371,7 @@
           <w:b w:val="0"/>
           <w:i w:val="0"/>
         </w:rPr>
-        <w:t>Check the semester selector on the left (section 6). You may be looking at a different semester, or at the wrong class. Also check that you signed in as yourself.</w:t>
+        <w:t>Check the semester selector on the left (section 6). You may be looking at a different semester, or at the wrong class. Also check that you signed in as yourself. If you truly see the “Set up your first class” screen, this browser has no data — see the first question above.</w:t>
       </w:r>
     </w:p>
     <w:p>
@@ -5396,7 +5570,7 @@
               <w:rPr>
                 <w:sz w:val="21"/>
               </w:rPr>
-              <w:t>Go to https://my-spr-with-mo.duckdns.org/ → Open the App → sign in.</w:t>
+              <w:t>Go to https://my-spr-with-mo.duckdns.org/ → Open the App → sign in. New start? Pick an option on the “Set up your first class” screen.</w:t>
             </w:r>
           </w:p>
         </w:tc>

</xml_diff>

<commit_message>
docs: manual v1.2 — all screenshots recaptured against current layout (azure landing, welcome choice screen, current app pages)
</commit_message>
<xml_diff>
--- a/media/manual/SPR-with-Mo_Teachers-Operation-Manual.docx
+++ b/media/manual/SPR-with-Mo_Teachers-Operation-Manual.docx
@@ -101,7 +101,7 @@
           <w:i w:val="0"/>
           <w:sz w:val="21"/>
         </w:rPr>
-        <w:t>Manual version 1.1  ·  October 2026</w:t>
+        <w:t>Manual version 1.2  ·  October 2026</w:t>
       </w:r>
     </w:p>
     <w:p>
@@ -674,7 +674,7 @@
         <w:spacing w:after="60"/>
       </w:pPr>
       <w:r>
-        <w:t>You will see the welcome page. Click the blue button “Open the App”.</w:t>
+        <w:t>You will see the welcome page. Click the white “Open the App” button (top right, or the big one in the middle).</w:t>
       </w:r>
     </w:p>
     <w:p>
@@ -3507,7 +3507,7 @@
       <w:r>
         <w:drawing>
           <wp:inline xmlns:a="http://schemas.openxmlformats.org/drawingml/2006/main" xmlns:pic="http://schemas.openxmlformats.org/drawingml/2006/picture">
-            <wp:extent cx="5760000" cy="5363631"/>
+            <wp:extent cx="5760000" cy="3795022"/>
             <wp:docPr id="17" name="Picture 17"/>
             <wp:cNvGraphicFramePr>
               <a:graphicFrameLocks noChangeAspect="1"/>
@@ -3528,7 +3528,7 @@
                   <pic:spPr>
                     <a:xfrm>
                       <a:off x="0" y="0"/>
-                      <a:ext cx="5760000" cy="5363631"/>
+                      <a:ext cx="5760000" cy="3795022"/>
                     </a:xfrm>
                     <a:prstGeom prst="rect"/>
                   </pic:spPr>
@@ -3691,7 +3691,7 @@
       <w:r>
         <w:drawing>
           <wp:inline xmlns:a="http://schemas.openxmlformats.org/drawingml/2006/main" xmlns:pic="http://schemas.openxmlformats.org/drawingml/2006/picture">
-            <wp:extent cx="5760000" cy="6299736"/>
+            <wp:extent cx="5030479" cy="7380000"/>
             <wp:docPr id="19" name="Picture 19"/>
             <wp:cNvGraphicFramePr>
               <a:graphicFrameLocks noChangeAspect="1"/>
@@ -3712,7 +3712,7 @@
                   <pic:spPr>
                     <a:xfrm>
                       <a:off x="0" y="0"/>
-                      <a:ext cx="5760000" cy="6299736"/>
+                      <a:ext cx="5030479" cy="7380000"/>
                     </a:xfrm>
                     <a:prstGeom prst="rect"/>
                   </pic:spPr>
@@ -3818,11 +3818,11 @@
               <a:graphicData uri="http://schemas.openxmlformats.org/drawingml/2006/picture">
                 <pic:pic>
                   <pic:nvPicPr>
-                    <pic:cNvPr id="0" name="71_report_card_view.png"/>
+                    <pic:cNvPr id="0" name="72_class_report.png"/>
                     <pic:cNvPicPr/>
                   </pic:nvPicPr>
                   <pic:blipFill>
-                    <a:blip r:embed="rId28"/>
+                    <a:blip r:embed="rId27"/>
                     <a:stretch>
                       <a:fillRect/>
                     </a:stretch>
@@ -3895,7 +3895,7 @@
                     <pic:cNvPicPr/>
                   </pic:nvPicPr>
                   <pic:blipFill>
-                    <a:blip r:embed="rId29"/>
+                    <a:blip r:embed="rId28"/>
                     <a:stretch>
                       <a:fillRect/>
                     </a:stretch>
@@ -4010,7 +4010,7 @@
                     <pic:cNvPicPr/>
                   </pic:nvPicPr>
                   <pic:blipFill>
-                    <a:blip r:embed="rId30"/>
+                    <a:blip r:embed="rId29"/>
                     <a:stretch>
                       <a:fillRect/>
                     </a:stretch>
@@ -4098,7 +4098,7 @@
                     <pic:cNvPicPr/>
                   </pic:nvPicPr>
                   <pic:blipFill>
-                    <a:blip r:embed="rId31"/>
+                    <a:blip r:embed="rId30"/>
                     <a:stretch>
                       <a:fillRect/>
                     </a:stretch>
@@ -4541,7 +4541,7 @@
                     <pic:cNvPicPr/>
                   </pic:nvPicPr>
                   <pic:blipFill>
-                    <a:blip r:embed="rId32"/>
+                    <a:blip r:embed="rId31"/>
                     <a:stretch>
                       <a:fillRect/>
                     </a:stretch>
@@ -4709,7 +4709,7 @@
                     <pic:cNvPicPr/>
                   </pic:nvPicPr>
                   <pic:blipFill>
-                    <a:blip r:embed="rId33"/>
+                    <a:blip r:embed="rId32"/>
                     <a:stretch>
                       <a:fillRect/>
                     </a:stretch>

</xml_diff>